<commit_message>
Bring docs/ up to date with the last three weeks of code changes
- PERFORMANCE_ANALYSIS: rename the stage-sum column to "compute" to match
  the committed results tables, define it, record that a stalled capture
  now fails a benchmark run, link the capture-sweep table, and correct two
  per-class cells (person F1, dining table precision) to the re-measured
  results/accuracy_int8.md.
- PRD: mark it approved; add §8 rows for the float64 NMS offset, the
  stall-vs-end split, and file sources blocking instead of dropping frames.
- DEMO_SHOTLIST: explain the "no frame for 2s" warning during a take.
- PROJECT_REPORT.docx: INT8 mAP@0.5:0.95 0.3315 (delta -0.0253), 130 tests,
  "Compute" column. The PDF still needs re-exporting from Word.

Co-Authored-By: Claude Opus 5.5 <noreply@anthropic.com>
</commit_message>
<xml_diff>
--- a/docs/PROJECT_REPORT.docx
+++ b/docs/PROJECT_REPORT.docx
@@ -2219,7 +2219,7 @@
                 <w:color w:val="FFFFFF"/>
                 <w:sz w:val="18"/>
               </w:rPr>
-              <w:t>Total</w:t>
+              <w:t>Compute</w:t>
             </w:r>
           </w:p>
         </w:tc>
@@ -2579,7 +2579,7 @@
                 <w:color w:val="334155"/>
                 <w:sz w:val="18"/>
               </w:rPr>
-              <w:t>0.3316</w:t>
+              <w:t>0.3315</w:t>
             </w:r>
           </w:p>
         </w:tc>
@@ -2617,7 +2617,7 @@
                 <w:color w:val="334155"/>
                 <w:sz w:val="18"/>
               </w:rPr>
-              <w:t>-0.0252 (-7.1%)</w:t>
+              <w:t>-0.0253 (-7.1%)</w:t>
             </w:r>
           </w:p>
         </w:tc>
@@ -4387,7 +4387,7 @@
                 <w:color w:val="334155"/>
                 <w:sz w:val="16"/>
               </w:rPr>
-              <w:t>python -m pytest (68 pass)</w:t>
+              <w:t>python -m pytest (130 pass)</w:t>
             </w:r>
           </w:p>
         </w:tc>

</xml_diff>